<commit_message>
Module 2 - Session 7 Added
</commit_message>
<xml_diff>
--- a/Assignment/SE - Introduction to Programming/Session 3/4_Variable naming rules in C.docx
+++ b/Assignment/SE - Introduction to Programming/Session 3/4_Variable naming rules in C.docx
@@ -254,7 +254,7 @@
         <w:rPr>
           <w:rtl w:val="0"/>
         </w:rPr>
-        <w:t xml:space="preserve">❌</w:t>
+        <w:t xml:space="preserve">❌Vvvhhgrgvryfffrfrfv and vvdfdfdg fd dhetrfrfrtrrtrtttrttrff wo nsam a ɛyɛ wo dɛ. G j. Vi hu r v r+5X frhrhghh</w:t>
       </w:r>
       <w:r>
         <w:rPr>
@@ -293,7 +293,7 @@
           <w:bCs w:val="1"/>
           <w:rtl w:val="0"/>
         </w:rPr>
-        <w:t xml:space="preserve">Alternative:</w:t>
+        <w:t xml:space="preserve">z aAlternative:</w:t>
       </w:r>
       <w:r>
         <w:rPr>
@@ -356,11 +356,6 @@
           <w:rtl w:val="0"/>
         </w:rPr>
         <w:t xml:space="preserve">is preferred as a common C naming convention.</w:t>
-      </w:r>
-      <w:r>
-        <w:rPr>
-          <w:rtl w:val="0"/>
-        </w:rPr>
       </w:r>
     </w:p>
     <w:sectPr>
@@ -518,6 +513,20 @@
       <w:sz w:val="48"/>
       <w:szCs w:val="48"/>
     </w:rPr>
+  </w:style>
+  <w:style w:type="table" w:styleId="TableNormal" w:default="1">
+    <w:name w:val="TableNormal"/>
+    <w:tblPr>
+      <w:tblCellMar>
+        <w:top w:w="100.0" w:type="dxa"/>
+        <w:left w:w="100.0" w:type="dxa"/>
+        <w:bottom w:w="100.0" w:type="dxa"/>
+        <w:right w:w="100.0" w:type="dxa"/>
+      </w:tblCellMar>
+    </w:tblPr>
+  </w:style>
+  <w:style w:type="paragraph" w:styleId="Normal" w:default="1">
+    <w:name w:val="normal"/>
   </w:style>
   <w:style w:type="paragraph" w:styleId="Subtitle">
     <w:name w:val="Subtitle"/>
@@ -855,4 +864,19 @@
   </a:objectDefaults>
   <a:extraClrSchemeLst/>
 </a:theme>
+</file>
+
+<file path=customXML/item1.xml><?xml version="1.0" encoding="utf-8"?>
+<go:gDocsCustomXmlDataStorage xmlns:go="http://customooxmlschemas.google.com/" xmlns:r="http://schemas.openxmlformats.org/officeDocument/2006/relationships" uri="GoogleDocsCustomDataVersion2">
+  <go:docsCustomData xmlns:go="http://customooxmlschemas.google.com/" roundtripDataSignature="AMtx7mg+Ud+C08U0SpJUIMgxU2zbev13sQ==">CgMxLjA4AHIhMS1WY2w1UHR5ZkFKUG8tZVZ1Q2U0d2xqb3YtMjN0blBR</go:docsCustomData>
+</go:gDocsCustomXmlDataStorage>
+</file>
+
+<file path=customXML/itemProps1.xml><?xml version="1.0" encoding="utf-8"?>
+<ds:datastoreItem xmlns:ds="http://schemas.openxmlformats.org/officeDocument/2006/customXml" ds:itemID="{11111111-1234-1234-1234-123412341234}">
+  <ds:schemaRefs>
+    <ds:schemaRef ds:uri="http://schemas.openxmlformats.org/officeDocument/2006/relationships"/>
+    <ds:schemaRef ds:uri="http://customooxmlschemas.google.com/"/>
+  </ds:schemaRefs>
+</ds:datastoreItem>
 </file>
</xml_diff>